<commit_message>
docs: keep SRS table rows together across pages
</commit_message>
<xml_diff>
--- a/docs/assignment3/MoodSky_A3_SRS.docx
+++ b/docs/assignment3/MoodSky_A3_SRS.docx
@@ -563,6 +563,8 @@
       <w:tr>
         <w:trPr>
           <w:jc w:val="center"/>
+          <w:cantSplit/>
+          <w:tblHeader/>
         </w:trPr>
         <w:tc>
           <w:tcPr>
@@ -620,6 +622,7 @@
       <w:tr>
         <w:trPr>
           <w:jc w:val="center"/>
+          <w:cantSplit/>
         </w:trPr>
         <w:tc>
           <w:tcPr>
@@ -673,6 +676,7 @@
       <w:tr>
         <w:trPr>
           <w:jc w:val="center"/>
+          <w:cantSplit/>
         </w:trPr>
         <w:tc>
           <w:tcPr>
@@ -730,6 +734,7 @@
       <w:tr>
         <w:trPr>
           <w:jc w:val="center"/>
+          <w:cantSplit/>
         </w:trPr>
         <w:tc>
           <w:tcPr>
@@ -787,6 +792,7 @@
       <w:tr>
         <w:trPr>
           <w:jc w:val="center"/>
+          <w:cantSplit/>
         </w:trPr>
         <w:tc>
           <w:tcPr>
@@ -844,6 +850,7 @@
       <w:tr>
         <w:trPr>
           <w:jc w:val="center"/>
+          <w:cantSplit/>
         </w:trPr>
         <w:tc>
           <w:tcPr>
@@ -901,6 +908,7 @@
       <w:tr>
         <w:trPr>
           <w:jc w:val="center"/>
+          <w:cantSplit/>
         </w:trPr>
         <w:tc>
           <w:tcPr>
@@ -954,6 +962,7 @@
       <w:tr>
         <w:trPr>
           <w:jc w:val="center"/>
+          <w:cantSplit/>
         </w:trPr>
         <w:tc>
           <w:tcPr>
@@ -1142,6 +1151,8 @@
       <w:tr>
         <w:trPr>
           <w:jc w:val="center"/>
+          <w:cantSplit/>
+          <w:tblHeader/>
         </w:trPr>
         <w:tc>
           <w:tcPr>
@@ -1225,6 +1236,7 @@
       <w:tr>
         <w:trPr>
           <w:jc w:val="center"/>
+          <w:cantSplit/>
         </w:trPr>
         <w:tc>
           <w:tcPr>
@@ -1306,6 +1318,7 @@
       <w:tr>
         <w:trPr>
           <w:jc w:val="center"/>
+          <w:cantSplit/>
         </w:trPr>
         <w:tc>
           <w:tcPr>
@@ -1387,6 +1400,7 @@
       <w:tr>
         <w:trPr>
           <w:jc w:val="center"/>
+          <w:cantSplit/>
         </w:trPr>
         <w:tc>
           <w:tcPr>
@@ -1472,6 +1486,7 @@
       <w:tr>
         <w:trPr>
           <w:jc w:val="center"/>
+          <w:cantSplit/>
         </w:trPr>
         <w:tc>
           <w:tcPr>
@@ -1553,6 +1568,7 @@
       <w:tr>
         <w:trPr>
           <w:jc w:val="center"/>
+          <w:cantSplit/>
         </w:trPr>
         <w:tc>
           <w:tcPr>
@@ -2137,6 +2153,8 @@
       <w:tr>
         <w:trPr>
           <w:jc w:val="center"/>
+          <w:cantSplit/>
+          <w:tblHeader/>
         </w:trPr>
         <w:tc>
           <w:tcPr>
@@ -2220,6 +2238,7 @@
       <w:tr>
         <w:trPr>
           <w:jc w:val="center"/>
+          <w:cantSplit/>
         </w:trPr>
         <w:tc>
           <w:tcPr>
@@ -2301,6 +2320,7 @@
       <w:tr>
         <w:trPr>
           <w:jc w:val="center"/>
+          <w:cantSplit/>
         </w:trPr>
         <w:tc>
           <w:tcPr>
@@ -2382,6 +2402,7 @@
       <w:tr>
         <w:trPr>
           <w:jc w:val="center"/>
+          <w:cantSplit/>
         </w:trPr>
         <w:tc>
           <w:tcPr>
@@ -2467,6 +2488,7 @@
       <w:tr>
         <w:trPr>
           <w:jc w:val="center"/>
+          <w:cantSplit/>
         </w:trPr>
         <w:tc>
           <w:tcPr>
@@ -2552,6 +2574,7 @@
       <w:tr>
         <w:trPr>
           <w:jc w:val="center"/>
+          <w:cantSplit/>
         </w:trPr>
         <w:tc>
           <w:tcPr>
@@ -3512,6 +3535,8 @@
       <w:tr>
         <w:trPr>
           <w:jc w:val="center"/>
+          <w:cantSplit/>
+          <w:tblHeader/>
         </w:trPr>
         <w:tc>
           <w:tcPr>
@@ -3595,6 +3620,7 @@
       <w:tr>
         <w:trPr>
           <w:jc w:val="center"/>
+          <w:cantSplit/>
         </w:trPr>
         <w:tc>
           <w:tcPr>
@@ -3680,6 +3706,7 @@
       <w:tr>
         <w:trPr>
           <w:jc w:val="center"/>
+          <w:cantSplit/>
         </w:trPr>
         <w:tc>
           <w:tcPr>
@@ -3765,6 +3792,7 @@
       <w:tr>
         <w:trPr>
           <w:jc w:val="center"/>
+          <w:cantSplit/>
         </w:trPr>
         <w:tc>
           <w:tcPr>
@@ -3846,6 +3874,7 @@
       <w:tr>
         <w:trPr>
           <w:jc w:val="center"/>
+          <w:cantSplit/>
         </w:trPr>
         <w:tc>
           <w:tcPr>
@@ -4024,6 +4053,8 @@
       <w:tr>
         <w:trPr>
           <w:jc w:val="center"/>
+          <w:cantSplit/>
+          <w:tblHeader/>
         </w:trPr>
         <w:tc>
           <w:tcPr>
@@ -4185,6 +4216,7 @@
       <w:tr>
         <w:trPr>
           <w:jc w:val="center"/>
+          <w:cantSplit/>
         </w:trPr>
         <w:tc>
           <w:tcPr>
@@ -4334,6 +4366,7 @@
       <w:tr>
         <w:trPr>
           <w:jc w:val="center"/>
+          <w:cantSplit/>
         </w:trPr>
         <w:tc>
           <w:tcPr>
@@ -4487,6 +4520,7 @@
       <w:tr>
         <w:trPr>
           <w:jc w:val="center"/>
+          <w:cantSplit/>
         </w:trPr>
         <w:tc>
           <w:tcPr>
@@ -4644,6 +4678,7 @@
       <w:tr>
         <w:trPr>
           <w:jc w:val="center"/>
+          <w:cantSplit/>
         </w:trPr>
         <w:tc>
           <w:tcPr>
@@ -4801,6 +4836,7 @@
       <w:tr>
         <w:trPr>
           <w:jc w:val="center"/>
+          <w:cantSplit/>
         </w:trPr>
         <w:tc>
           <w:tcPr>
@@ -4950,6 +4986,7 @@
       <w:tr>
         <w:trPr>
           <w:jc w:val="center"/>
+          <w:cantSplit/>
         </w:trPr>
         <w:tc>
           <w:tcPr>
@@ -5103,6 +5140,7 @@
       <w:tr>
         <w:trPr>
           <w:jc w:val="center"/>
+          <w:cantSplit/>
         </w:trPr>
         <w:tc>
           <w:tcPr>
@@ -5256,6 +5294,7 @@
       <w:tr>
         <w:trPr>
           <w:jc w:val="center"/>
+          <w:cantSplit/>
         </w:trPr>
         <w:tc>
           <w:tcPr>
@@ -5409,6 +5448,7 @@
       <w:tr>
         <w:trPr>
           <w:jc w:val="center"/>
+          <w:cantSplit/>
         </w:trPr>
         <w:tc>
           <w:tcPr>
@@ -5562,6 +5602,7 @@
       <w:tr>
         <w:trPr>
           <w:jc w:val="center"/>
+          <w:cantSplit/>
         </w:trPr>
         <w:tc>
           <w:tcPr>
@@ -5716,6 +5757,7 @@
       <w:tr>
         <w:trPr>
           <w:jc w:val="center"/>
+          <w:cantSplit/>
         </w:trPr>
         <w:tc>
           <w:tcPr>
@@ -5873,6 +5915,7 @@
       <w:tr>
         <w:trPr>
           <w:jc w:val="center"/>
+          <w:cantSplit/>
         </w:trPr>
         <w:tc>
           <w:tcPr>
@@ -6026,6 +6069,7 @@
       <w:tr>
         <w:trPr>
           <w:jc w:val="center"/>
+          <w:cantSplit/>
         </w:trPr>
         <w:tc>
           <w:tcPr>
@@ -6179,6 +6223,7 @@
       <w:tr>
         <w:trPr>
           <w:jc w:val="center"/>
+          <w:cantSplit/>
         </w:trPr>
         <w:tc>
           <w:tcPr>
@@ -6332,6 +6377,7 @@
       <w:tr>
         <w:trPr>
           <w:jc w:val="center"/>
+          <w:cantSplit/>
         </w:trPr>
         <w:tc>
           <w:tcPr>
@@ -6485,6 +6531,7 @@
       <w:tr>
         <w:trPr>
           <w:jc w:val="center"/>
+          <w:cantSplit/>
         </w:trPr>
         <w:tc>
           <w:tcPr>
@@ -6638,6 +6685,7 @@
       <w:tr>
         <w:trPr>
           <w:jc w:val="center"/>
+          <w:cantSplit/>
         </w:trPr>
         <w:tc>
           <w:tcPr>
@@ -6795,6 +6843,7 @@
       <w:tr>
         <w:trPr>
           <w:jc w:val="center"/>
+          <w:cantSplit/>
         </w:trPr>
         <w:tc>
           <w:tcPr>
@@ -6952,6 +7001,7 @@
       <w:tr>
         <w:trPr>
           <w:jc w:val="center"/>
+          <w:cantSplit/>
         </w:trPr>
         <w:tc>
           <w:tcPr>
@@ -7105,6 +7155,7 @@
       <w:tr>
         <w:trPr>
           <w:jc w:val="center"/>
+          <w:cantSplit/>
         </w:trPr>
         <w:tc>
           <w:tcPr>
@@ -7262,6 +7313,7 @@
       <w:tr>
         <w:trPr>
           <w:jc w:val="center"/>
+          <w:cantSplit/>
         </w:trPr>
         <w:tc>
           <w:tcPr>
@@ -7415,6 +7467,7 @@
       <w:tr>
         <w:trPr>
           <w:jc w:val="center"/>
+          <w:cantSplit/>
         </w:trPr>
         <w:tc>
           <w:tcPr>
@@ -7572,6 +7625,7 @@
       <w:tr>
         <w:trPr>
           <w:jc w:val="center"/>
+          <w:cantSplit/>
         </w:trPr>
         <w:tc>
           <w:tcPr>
@@ -7725,6 +7779,7 @@
       <w:tr>
         <w:trPr>
           <w:jc w:val="center"/>
+          <w:cantSplit/>
         </w:trPr>
         <w:tc>
           <w:tcPr>
@@ -8005,6 +8060,8 @@
       <w:tr>
         <w:trPr>
           <w:jc w:val="center"/>
+          <w:cantSplit/>
+          <w:tblHeader/>
         </w:trPr>
         <w:tc>
           <w:tcPr>
@@ -8088,6 +8145,7 @@
       <w:tr>
         <w:trPr>
           <w:jc w:val="center"/>
+          <w:cantSplit/>
         </w:trPr>
         <w:tc>
           <w:tcPr>
@@ -8169,6 +8227,7 @@
       <w:tr>
         <w:trPr>
           <w:jc w:val="center"/>
+          <w:cantSplit/>
         </w:trPr>
         <w:tc>
           <w:tcPr>
@@ -8250,6 +8309,7 @@
       <w:tr>
         <w:trPr>
           <w:jc w:val="center"/>
+          <w:cantSplit/>
         </w:trPr>
         <w:tc>
           <w:tcPr>
@@ -8331,6 +8391,7 @@
       <w:tr>
         <w:trPr>
           <w:jc w:val="center"/>
+          <w:cantSplit/>
         </w:trPr>
         <w:tc>
           <w:tcPr>
@@ -8412,6 +8473,7 @@
       <w:tr>
         <w:trPr>
           <w:jc w:val="center"/>
+          <w:cantSplit/>
         </w:trPr>
         <w:tc>
           <w:tcPr>
@@ -8539,6 +8601,8 @@
       <w:tr>
         <w:trPr>
           <w:jc w:val="center"/>
+          <w:cantSplit/>
+          <w:tblHeader/>
         </w:trPr>
         <w:tc>
           <w:tcPr>
@@ -8622,6 +8686,7 @@
       <w:tr>
         <w:trPr>
           <w:jc w:val="center"/>
+          <w:cantSplit/>
         </w:trPr>
         <w:tc>
           <w:tcPr>
@@ -8703,6 +8768,7 @@
       <w:tr>
         <w:trPr>
           <w:jc w:val="center"/>
+          <w:cantSplit/>
         </w:trPr>
         <w:tc>
           <w:tcPr>
@@ -8788,6 +8854,7 @@
       <w:tr>
         <w:trPr>
           <w:jc w:val="center"/>
+          <w:cantSplit/>
         </w:trPr>
         <w:tc>
           <w:tcPr>
@@ -8873,6 +8940,7 @@
       <w:tr>
         <w:trPr>
           <w:jc w:val="center"/>
+          <w:cantSplit/>
         </w:trPr>
         <w:tc>
           <w:tcPr>
@@ -9072,6 +9140,8 @@
       <w:tr>
         <w:trPr>
           <w:jc w:val="center"/>
+          <w:cantSplit/>
+          <w:tblHeader/>
         </w:trPr>
         <w:tc>
           <w:tcPr>
@@ -9181,6 +9251,7 @@
       <w:tr>
         <w:trPr>
           <w:jc w:val="center"/>
+          <w:cantSplit/>
         </w:trPr>
         <w:tc>
           <w:tcPr>
@@ -9286,6 +9357,7 @@
       <w:tr>
         <w:trPr>
           <w:jc w:val="center"/>
+          <w:cantSplit/>
         </w:trPr>
         <w:tc>
           <w:tcPr>
@@ -9395,6 +9467,7 @@
       <w:tr>
         <w:trPr>
           <w:jc w:val="center"/>
+          <w:cantSplit/>
         </w:trPr>
         <w:tc>
           <w:tcPr>
@@ -9504,6 +9577,7 @@
       <w:tr>
         <w:trPr>
           <w:jc w:val="center"/>
+          <w:cantSplit/>
         </w:trPr>
         <w:tc>
           <w:tcPr>
@@ -9609,6 +9683,7 @@
       <w:tr>
         <w:trPr>
           <w:jc w:val="center"/>
+          <w:cantSplit/>
         </w:trPr>
         <w:tc>
           <w:tcPr>
@@ -9878,6 +9953,8 @@
       <w:tr>
         <w:trPr>
           <w:jc w:val="center"/>
+          <w:cantSplit/>
+          <w:tblHeader/>
         </w:trPr>
         <w:tc>
           <w:tcPr>
@@ -9987,6 +10064,7 @@
       <w:tr>
         <w:trPr>
           <w:jc w:val="center"/>
+          <w:cantSplit/>
         </w:trPr>
         <w:tc>
           <w:tcPr>
@@ -10093,6 +10171,7 @@
       <w:tr>
         <w:trPr>
           <w:jc w:val="center"/>
+          <w:cantSplit/>
         </w:trPr>
         <w:tc>
           <w:tcPr>
@@ -10202,6 +10281,7 @@
       <w:tr>
         <w:trPr>
           <w:jc w:val="center"/>
+          <w:cantSplit/>
         </w:trPr>
         <w:tc>
           <w:tcPr>
@@ -10311,6 +10391,7 @@
       <w:tr>
         <w:trPr>
           <w:jc w:val="center"/>
+          <w:cantSplit/>
         </w:trPr>
         <w:tc>
           <w:tcPr>
@@ -10420,6 +10501,7 @@
       <w:tr>
         <w:trPr>
           <w:jc w:val="center"/>
+          <w:cantSplit/>
         </w:trPr>
         <w:tc>
           <w:tcPr>
@@ -10529,6 +10611,7 @@
       <w:tr>
         <w:trPr>
           <w:jc w:val="center"/>
+          <w:cantSplit/>
         </w:trPr>
         <w:tc>
           <w:tcPr>
@@ -10634,6 +10717,7 @@
       <w:tr>
         <w:trPr>
           <w:jc w:val="center"/>
+          <w:cantSplit/>
         </w:trPr>
         <w:tc>
           <w:tcPr>
@@ -10743,6 +10827,7 @@
       <w:tr>
         <w:trPr>
           <w:jc w:val="center"/>
+          <w:cantSplit/>
         </w:trPr>
         <w:tc>
           <w:tcPr>
@@ -10904,6 +10989,8 @@
       <w:tr>
         <w:trPr>
           <w:jc w:val="center"/>
+          <w:cantSplit/>
+          <w:tblHeader/>
         </w:trPr>
         <w:tc>
           <w:tcPr>
@@ -11013,6 +11100,7 @@
       <w:tr>
         <w:trPr>
           <w:jc w:val="center"/>
+          <w:cantSplit/>
         </w:trPr>
         <w:tc>
           <w:tcPr>
@@ -11141,6 +11229,7 @@
       <w:tr>
         <w:trPr>
           <w:jc w:val="center"/>
+          <w:cantSplit/>
         </w:trPr>
         <w:tc>
           <w:tcPr>
@@ -11250,6 +11339,7 @@
       <w:tr>
         <w:trPr>
           <w:jc w:val="center"/>
+          <w:cantSplit/>
         </w:trPr>
         <w:tc>
           <w:tcPr>
@@ -11378,6 +11468,7 @@
       <w:tr>
         <w:trPr>
           <w:jc w:val="center"/>
+          <w:cantSplit/>
         </w:trPr>
         <w:tc>
           <w:tcPr>
@@ -11510,6 +11601,7 @@
       <w:tr>
         <w:trPr>
           <w:jc w:val="center"/>
+          <w:cantSplit/>
         </w:trPr>
         <w:tc>
           <w:tcPr>
@@ -11638,6 +11730,7 @@
       <w:tr>
         <w:trPr>
           <w:jc w:val="center"/>
+          <w:cantSplit/>
         </w:trPr>
         <w:tc>
           <w:tcPr>
@@ -11767,6 +11860,7 @@
       <w:tr>
         <w:trPr>
           <w:jc w:val="center"/>
+          <w:cantSplit/>
         </w:trPr>
         <w:tc>
           <w:tcPr>
@@ -11895,6 +11989,7 @@
       <w:tr>
         <w:trPr>
           <w:jc w:val="center"/>
+          <w:cantSplit/>
         </w:trPr>
         <w:tc>
           <w:tcPr>
@@ -12023,6 +12118,7 @@
       <w:tr>
         <w:trPr>
           <w:jc w:val="center"/>
+          <w:cantSplit/>
         </w:trPr>
         <w:tc>
           <w:tcPr>
@@ -12132,6 +12228,7 @@
       <w:tr>
         <w:trPr>
           <w:jc w:val="center"/>
+          <w:cantSplit/>
         </w:trPr>
         <w:tc>
           <w:tcPr>
@@ -12264,6 +12361,7 @@
       <w:tr>
         <w:trPr>
           <w:jc w:val="center"/>
+          <w:cantSplit/>
         </w:trPr>
         <w:tc>
           <w:tcPr>
@@ -12392,6 +12490,7 @@
       <w:tr>
         <w:trPr>
           <w:jc w:val="center"/>
+          <w:cantSplit/>
         </w:trPr>
         <w:tc>
           <w:tcPr>
@@ -12599,6 +12698,8 @@
       <w:tr>
         <w:trPr>
           <w:jc w:val="center"/>
+          <w:cantSplit/>
+          <w:tblHeader/>
         </w:trPr>
         <w:tc>
           <w:tcPr>
@@ -12682,6 +12783,7 @@
       <w:tr>
         <w:trPr>
           <w:jc w:val="center"/>
+          <w:cantSplit/>
         </w:trPr>
         <w:tc>
           <w:tcPr>
@@ -12770,6 +12872,7 @@
       <w:tr>
         <w:trPr>
           <w:jc w:val="center"/>
+          <w:cantSplit/>
         </w:trPr>
         <w:tc>
           <w:tcPr>
@@ -12851,6 +12954,7 @@
       <w:tr>
         <w:trPr>
           <w:jc w:val="center"/>
+          <w:cantSplit/>
         </w:trPr>
         <w:tc>
           <w:tcPr>
@@ -12936,6 +13040,7 @@
       <w:tr>
         <w:trPr>
           <w:jc w:val="center"/>
+          <w:cantSplit/>
         </w:trPr>
         <w:tc>
           <w:tcPr>
@@ -13078,6 +13183,8 @@
       <w:tr>
         <w:trPr>
           <w:jc w:val="center"/>
+          <w:cantSplit/>
+          <w:tblHeader/>
         </w:trPr>
         <w:tc>
           <w:tcPr>
@@ -13161,6 +13268,7 @@
       <w:tr>
         <w:trPr>
           <w:jc w:val="center"/>
+          <w:cantSplit/>
         </w:trPr>
         <w:tc>
           <w:tcPr>
@@ -13246,6 +13354,7 @@
       <w:tr>
         <w:trPr>
           <w:jc w:val="center"/>
+          <w:cantSplit/>
         </w:trPr>
         <w:tc>
           <w:tcPr>
@@ -13331,6 +13440,7 @@
       <w:tr>
         <w:trPr>
           <w:jc w:val="center"/>
+          <w:cantSplit/>
         </w:trPr>
         <w:tc>
           <w:tcPr>
@@ -13412,6 +13522,7 @@
       <w:tr>
         <w:trPr>
           <w:jc w:val="center"/>
+          <w:cantSplit/>
         </w:trPr>
         <w:tc>
           <w:tcPr>
@@ -13497,6 +13608,7 @@
       <w:tr>
         <w:trPr>
           <w:jc w:val="center"/>
+          <w:cantSplit/>
         </w:trPr>
         <w:tc>
           <w:tcPr>
@@ -13582,6 +13694,7 @@
       <w:tr>
         <w:trPr>
           <w:jc w:val="center"/>
+          <w:cantSplit/>
         </w:trPr>
         <w:tc>
           <w:tcPr>
@@ -13811,6 +13924,8 @@
       <w:tr>
         <w:trPr>
           <w:jc w:val="center"/>
+          <w:cantSplit/>
+          <w:tblHeader/>
         </w:trPr>
         <w:tc>
           <w:tcPr>
@@ -13894,6 +14009,7 @@
       <w:tr>
         <w:trPr>
           <w:jc w:val="center"/>
+          <w:cantSplit/>
         </w:trPr>
         <w:tc>
           <w:tcPr>
@@ -13975,6 +14091,7 @@
       <w:tr>
         <w:trPr>
           <w:jc w:val="center"/>
+          <w:cantSplit/>
         </w:trPr>
         <w:tc>
           <w:tcPr>
@@ -14052,6 +14169,7 @@
       <w:tr>
         <w:trPr>
           <w:jc w:val="center"/>
+          <w:cantSplit/>
         </w:trPr>
         <w:tc>
           <w:tcPr>
@@ -14179,6 +14297,8 @@
       <w:tr>
         <w:trPr>
           <w:jc w:val="center"/>
+          <w:cantSplit/>
+          <w:tblHeader/>
         </w:trPr>
         <w:tc>
           <w:tcPr>
@@ -14262,6 +14382,7 @@
       <w:tr>
         <w:trPr>
           <w:jc w:val="center"/>
+          <w:cantSplit/>
         </w:trPr>
         <w:tc>
           <w:tcPr>
@@ -14347,6 +14468,7 @@
       <w:tr>
         <w:trPr>
           <w:jc w:val="center"/>
+          <w:cantSplit/>
         </w:trPr>
         <w:tc>
           <w:tcPr>
@@ -14433,6 +14555,7 @@
       <w:tr>
         <w:trPr>
           <w:jc w:val="center"/>
+          <w:cantSplit/>
         </w:trPr>
         <w:tc>
           <w:tcPr>
@@ -14518,6 +14641,7 @@
       <w:tr>
         <w:trPr>
           <w:jc w:val="center"/>
+          <w:cantSplit/>
         </w:trPr>
         <w:tc>
           <w:tcPr>
@@ -14599,6 +14723,7 @@
       <w:tr>
         <w:trPr>
           <w:jc w:val="center"/>
+          <w:cantSplit/>
         </w:trPr>
         <w:tc>
           <w:tcPr>
@@ -14680,6 +14805,7 @@
       <w:tr>
         <w:trPr>
           <w:jc w:val="center"/>
+          <w:cantSplit/>
         </w:trPr>
         <w:tc>
           <w:tcPr>

</xml_diff>